<commit_message>
U3S1L5 - Traffic Report [reupload]
non avevo salvato l'ultima pagina
</commit_message>
<xml_diff>
--- a/U3S1L5 - Traffic analysis/U3S1L5 - Traffic Report.docx
+++ b/U3S1L5 - Traffic analysis/U3S1L5 - Traffic Report.docx
@@ -5,14 +5,8 @@
     <w:p>
       <w:pPr>
         <w:pStyle w:val="Heading1"/>
-        <w:rPr>
-          <w:lang w:val="en-US"/>
-        </w:rPr>
-      </w:pPr>
-      <w:r>
-        <w:rPr>
-          <w:lang w:val="en-US"/>
-        </w:rPr>
+      </w:pPr>
+      <w:r>
         <w:t>wireshark traffic analysis:</w:t>
       </w:r>
     </w:p>
@@ -1189,7 +1183,7 @@
         </w:rPr>
         <w:lastRenderedPageBreak/>
         <w:drawing>
-          <wp:anchor distT="0" distB="0" distL="114300" distR="114300" simplePos="0" relativeHeight="251679744" behindDoc="0" locked="0" layoutInCell="1" allowOverlap="1" wp14:anchorId="2E9DE6CC" wp14:editId="3BA4F570">
+          <wp:anchor distT="0" distB="0" distL="114300" distR="114300" simplePos="0" relativeHeight="251693056" behindDoc="0" locked="0" layoutInCell="1" allowOverlap="1" wp14:anchorId="39641D8C" wp14:editId="50CE51B6">
             <wp:simplePos x="0" y="0"/>
             <wp:positionH relativeFrom="margin">
               <wp:align>left</wp:align>
@@ -1261,7 +1255,7 @@
           <w:noProof/>
         </w:rPr>
         <w:drawing>
-          <wp:anchor distT="0" distB="0" distL="114300" distR="114300" simplePos="0" relativeHeight="251678720" behindDoc="0" locked="0" layoutInCell="1" allowOverlap="1" wp14:anchorId="4CA2C3FF" wp14:editId="25F9BBAC">
+          <wp:anchor distT="0" distB="0" distL="114300" distR="114300" simplePos="0" relativeHeight="251692032" behindDoc="0" locked="0" layoutInCell="1" allowOverlap="1" wp14:anchorId="16218265" wp14:editId="1E9416EA">
             <wp:simplePos x="0" y="0"/>
             <wp:positionH relativeFrom="margin">
               <wp:align>left</wp:align>
@@ -1333,7 +1327,7 @@
           <w:noProof/>
         </w:rPr>
         <w:drawing>
-          <wp:anchor distT="0" distB="0" distL="114300" distR="114300" simplePos="0" relativeHeight="251677696" behindDoc="0" locked="0" layoutInCell="1" allowOverlap="1" wp14:anchorId="51279209" wp14:editId="23AB989B">
+          <wp:anchor distT="0" distB="0" distL="114300" distR="114300" simplePos="0" relativeHeight="251691008" behindDoc="0" locked="0" layoutInCell="1" allowOverlap="1" wp14:anchorId="323FC7A8" wp14:editId="53DB37CB">
             <wp:simplePos x="0" y="0"/>
             <wp:positionH relativeFrom="margin">
               <wp:align>left</wp:align>
@@ -1405,7 +1399,7 @@
           <w:noProof/>
         </w:rPr>
         <w:drawing>
-          <wp:anchor distT="0" distB="0" distL="114300" distR="114300" simplePos="0" relativeHeight="251676672" behindDoc="0" locked="0" layoutInCell="1" allowOverlap="1" wp14:anchorId="50F7E512" wp14:editId="7694C419">
+          <wp:anchor distT="0" distB="0" distL="114300" distR="114300" simplePos="0" relativeHeight="251689984" behindDoc="0" locked="0" layoutInCell="1" allowOverlap="1" wp14:anchorId="1BF856B1" wp14:editId="21228604">
             <wp:simplePos x="0" y="0"/>
             <wp:positionH relativeFrom="margin">
               <wp:align>left</wp:align>
@@ -1477,7 +1471,7 @@
           <w:noProof/>
         </w:rPr>
         <w:drawing>
-          <wp:anchor distT="0" distB="0" distL="114300" distR="114300" simplePos="0" relativeHeight="251675648" behindDoc="0" locked="0" layoutInCell="1" allowOverlap="1" wp14:anchorId="26BCEF7A" wp14:editId="146DFE91">
+          <wp:anchor distT="0" distB="0" distL="114300" distR="114300" simplePos="0" relativeHeight="251688960" behindDoc="0" locked="0" layoutInCell="1" allowOverlap="1" wp14:anchorId="447C0665" wp14:editId="650E1A58">
             <wp:simplePos x="0" y="0"/>
             <wp:positionH relativeFrom="margin">
               <wp:align>left</wp:align>
@@ -1549,7 +1543,7 @@
           <w:noProof/>
         </w:rPr>
         <w:drawing>
-          <wp:anchor distT="0" distB="0" distL="114300" distR="114300" simplePos="0" relativeHeight="251674624" behindDoc="0" locked="0" layoutInCell="1" allowOverlap="1" wp14:anchorId="39126F7D" wp14:editId="44EF36BE">
+          <wp:anchor distT="0" distB="0" distL="114300" distR="114300" simplePos="0" relativeHeight="251687936" behindDoc="0" locked="0" layoutInCell="1" allowOverlap="1" wp14:anchorId="69159103" wp14:editId="7B690145">
             <wp:simplePos x="0" y="0"/>
             <wp:positionH relativeFrom="margin">
               <wp:align>left</wp:align>
@@ -1621,7 +1615,7 @@
           <w:noProof/>
         </w:rPr>
         <w:drawing>
-          <wp:anchor distT="0" distB="0" distL="114300" distR="114300" simplePos="0" relativeHeight="251669504" behindDoc="0" locked="0" layoutInCell="1" allowOverlap="1" wp14:anchorId="4E908C22" wp14:editId="5A92E567">
+          <wp:anchor distT="0" distB="0" distL="114300" distR="114300" simplePos="0" relativeHeight="251682816" behindDoc="0" locked="0" layoutInCell="1" allowOverlap="1" wp14:anchorId="0662A476" wp14:editId="114C0807">
             <wp:simplePos x="0" y="0"/>
             <wp:positionH relativeFrom="margin">
               <wp:posOffset>-78105</wp:posOffset>
@@ -1693,7 +1687,7 @@
           <w:noProof/>
         </w:rPr>
         <w:drawing>
-          <wp:anchor distT="0" distB="0" distL="114300" distR="114300" simplePos="0" relativeHeight="251671552" behindDoc="0" locked="0" layoutInCell="1" allowOverlap="1" wp14:anchorId="773331E2" wp14:editId="4CE67F62">
+          <wp:anchor distT="0" distB="0" distL="114300" distR="114300" simplePos="0" relativeHeight="251684864" behindDoc="0" locked="0" layoutInCell="1" allowOverlap="1" wp14:anchorId="2CDCC11F" wp14:editId="2BE98E2A">
             <wp:simplePos x="0" y="0"/>
             <wp:positionH relativeFrom="column">
               <wp:posOffset>-78105</wp:posOffset>
@@ -1765,7 +1759,7 @@
           <w:noProof/>
         </w:rPr>
         <w:drawing>
-          <wp:anchor distT="0" distB="0" distL="114300" distR="114300" simplePos="0" relativeHeight="251673600" behindDoc="0" locked="0" layoutInCell="1" allowOverlap="1" wp14:anchorId="01690F19" wp14:editId="538E3E10">
+          <wp:anchor distT="0" distB="0" distL="114300" distR="114300" simplePos="0" relativeHeight="251686912" behindDoc="0" locked="0" layoutInCell="1" allowOverlap="1" wp14:anchorId="39FFBB2C" wp14:editId="22BC5FA0">
             <wp:simplePos x="0" y="0"/>
             <wp:positionH relativeFrom="margin">
               <wp:align>left</wp:align>
@@ -1837,7 +1831,7 @@
           <w:noProof/>
         </w:rPr>
         <w:drawing>
-          <wp:anchor distT="0" distB="0" distL="114300" distR="114300" simplePos="0" relativeHeight="251672576" behindDoc="0" locked="0" layoutInCell="1" allowOverlap="1" wp14:anchorId="4AEEDBEC" wp14:editId="0C7C41D0">
+          <wp:anchor distT="0" distB="0" distL="114300" distR="114300" simplePos="0" relativeHeight="251685888" behindDoc="0" locked="0" layoutInCell="1" allowOverlap="1" wp14:anchorId="2FAD5265" wp14:editId="273EBB4B">
             <wp:simplePos x="0" y="0"/>
             <wp:positionH relativeFrom="margin">
               <wp:align>left</wp:align>
@@ -1909,7 +1903,7 @@
           <w:noProof/>
         </w:rPr>
         <w:drawing>
-          <wp:anchor distT="0" distB="0" distL="114300" distR="114300" simplePos="0" relativeHeight="251670528" behindDoc="0" locked="0" layoutInCell="1" allowOverlap="1" wp14:anchorId="58F82F3B" wp14:editId="6CE29976">
+          <wp:anchor distT="0" distB="0" distL="114300" distR="114300" simplePos="0" relativeHeight="251683840" behindDoc="0" locked="0" layoutInCell="1" allowOverlap="1" wp14:anchorId="2CA3F47A" wp14:editId="28E6CA0F">
             <wp:simplePos x="0" y="0"/>
             <wp:positionH relativeFrom="margin">
               <wp:align>left</wp:align>
@@ -1975,6 +1969,141 @@
             </wp14:sizeRelV>
           </wp:anchor>
         </w:drawing>
+      </w:r>
+    </w:p>
+    <w:p/>
+    <w:p/>
+    <w:p/>
+    <w:p/>
+    <w:p/>
+    <w:p/>
+    <w:p/>
+    <w:p/>
+    <w:p/>
+    <w:p/>
+    <w:p/>
+    <w:p/>
+    <w:p/>
+    <w:p/>
+    <w:p/>
+    <w:p/>
+    <w:p/>
+    <w:p/>
+    <w:p/>
+    <w:p>
+      <w:pPr>
+        <w:pStyle w:val="Heading2"/>
+      </w:pPr>
+      <w:r>
+        <w:t>come evitare futuri attacchi simili:</w:t>
+      </w:r>
+    </w:p>
+    <w:p>
+      <w:r>
+        <w:br/>
+        <w:t>Risoluzione immediata a breve termine:</w:t>
+      </w:r>
+      <w:r>
+        <w:br/>
+        <w:t>1) Isolare target dal network</w:t>
+      </w:r>
+      <w:r>
+        <w:br/>
+        <w:t>2) Bloccare tutto il traffico da attaccante</w:t>
+      </w:r>
+      <w:r>
+        <w:br/>
+        <w:t xml:space="preserve">3) Disabilitare i servizi </w:t>
+      </w:r>
+      <w:proofErr w:type="spellStart"/>
+      <w:r>
+        <w:t>rexec</w:t>
+      </w:r>
+      <w:proofErr w:type="spellEnd"/>
+      <w:r>
+        <w:t xml:space="preserve">, </w:t>
+      </w:r>
+      <w:proofErr w:type="spellStart"/>
+      <w:r>
+        <w:t>rlogin</w:t>
+      </w:r>
+      <w:proofErr w:type="spellEnd"/>
+      <w:r>
+        <w:t xml:space="preserve">, </w:t>
+      </w:r>
+      <w:proofErr w:type="spellStart"/>
+      <w:r>
+        <w:t>rsh</w:t>
+      </w:r>
+      <w:proofErr w:type="spellEnd"/>
+      <w:r>
+        <w:br/>
+      </w:r>
+      <w:r>
+        <w:br/>
+      </w:r>
+      <w:proofErr w:type="spellStart"/>
+      <w:r>
+        <w:t>Remediation</w:t>
+      </w:r>
+      <w:proofErr w:type="spellEnd"/>
+      <w:r>
+        <w:t>:</w:t>
+      </w:r>
+      <w:r>
+        <w:br/>
+        <w:t xml:space="preserve">1) </w:t>
+      </w:r>
+      <w:proofErr w:type="spellStart"/>
+      <w:r>
+        <w:t>Patchare</w:t>
+      </w:r>
+      <w:proofErr w:type="spellEnd"/>
+      <w:r>
+        <w:t xml:space="preserve"> e aggiornare servizi vulnerabili</w:t>
+      </w:r>
+      <w:r>
+        <w:br/>
+        <w:t>2) Disabilitare Telnet</w:t>
+      </w:r>
+      <w:r>
+        <w:br/>
+        <w:t>3) Implementare policy firewall che nascondino lo stato di porte non essenziali</w:t>
+      </w:r>
+      <w:r>
+        <w:br/>
+      </w:r>
+      <w:r>
+        <w:br/>
+        <w:t>Prevenzione futura:</w:t>
+      </w:r>
+      <w:r>
+        <w:br/>
+        <w:t>1) Utilizzo di IDS/IPS per risposta automatizzata a traffico anomalo</w:t>
+      </w:r>
+      <w:r>
+        <w:br/>
+        <w:t xml:space="preserve">2) Regolare </w:t>
+      </w:r>
+      <w:proofErr w:type="spellStart"/>
+      <w:r>
+        <w:t>scan</w:t>
+      </w:r>
+      <w:proofErr w:type="spellEnd"/>
+      <w:r>
+        <w:t xml:space="preserve"> di vulnerabilità e susseguente patch</w:t>
+      </w:r>
+      <w:r>
+        <w:br/>
+        <w:t xml:space="preserve">3) Segmentazione network: Attaccanti non dovrebbero poter avere accesso ad un </w:t>
+      </w:r>
+      <w:proofErr w:type="spellStart"/>
+      <w:r>
+        <w:t>host</w:t>
+      </w:r>
+      <w:proofErr w:type="spellEnd"/>
+      <w:r>
+        <w:t xml:space="preserve"> critico direttamente all’interno della nostra rete.</w:t>
       </w:r>
     </w:p>
     <w:sectPr>

</xml_diff>